<commit_message>
Second review pass: correct robustness provenance, sign convention for out-of-sample gain, define VEIN and H1 before use, clarify intervals and table notes
</commit_message>
<xml_diff>
--- a/manuscript/vein_manuscript_blind.docx
+++ b/manuscript/vein_manuscript_blind.docx
@@ -358,7 +358,7 @@
         <w:pStyle w:val="BodyText"/>
       </w:pPr>
       <w:r>
-        <w:t xml:space="preserve">We make four contributions.</w:t>
+        <w:t xml:space="preserve">We call the framework VEIN (ledger-specified on-chain causal risk attribution) and make four contributions.</w:t>
       </w:r>
     </w:p>
     <w:p>
@@ -508,7 +508,7 @@
         </w:r>
       </w:hyperlink>
       <w:r>
-        <w:t xml:space="preserve">, Section </w:t>
+        <w:t xml:space="preserve">, applied in Section </w:t>
       </w:r>
       <w:hyperlink w:anchor="subsec:attribution">
         <w:r>
@@ -724,7 +724,13 @@
         <w:t xml:space="preserve"> </w:t>
       </w:r>
       <w:r>
-        <w:t xml:space="preserve">0.273, and out of sample the network changes squared error by</w:t>
+        <w:t xml:space="preserve">0.273, and out of sample the network’s squared-error gain over an</w:t>
+      </w:r>
+      <w:r>
+        <w:t xml:space="preserve"> </w:t>
+      </w:r>
+      <w:r>
+        <w:t xml:space="preserve">own-lag model is</w:t>
       </w:r>
       <w:r>
         <w:t xml:space="preserve"> </w:t>
@@ -738,13 +744,7 @@
         </m:r>
       </m:oMath>
       <w:r>
-        <w:t xml:space="preserve">0.3% relative to an</w:t>
-      </w:r>
-      <w:r>
-        <w:t xml:space="preserve"> </w:t>
-      </w:r>
-      <w:r>
-        <w:t xml:space="preserve">own-lag model (interval [</w:t>
+        <w:t xml:space="preserve">0.3% (negative means larger error; interval [</w:t>
       </w:r>
       <m:oMath>
         <m:r>
@@ -773,7 +773,18 @@
         <w:t xml:space="preserve"> </w:t>
       </w:r>
       <w:r>
-        <w:t xml:space="preserve">are not resolved in pairwise order. The observed graph does not clearly beat price-estimated graphs, so H1 is</w:t>
+        <w:t xml:space="preserve">are not resolved in pairwise order. The observed graph does not clearly beat price-estimated graphs, so the hypothesis (H1, Section </w:t>
+      </w:r>
+      <w:hyperlink w:anchor="sec:method">
+        <w:r>
+          <w:rPr>
+            <w:rStyle w:val="Hyperlink"/>
+          </w:rPr>
+          <w:t xml:space="preserve">3</w:t>
+        </w:r>
+      </w:hyperlink>
+      <w:r>
+        <w:t xml:space="preserve">) that the observed graph is better is</w:t>
       </w:r>
       <w:r>
         <w:t xml:space="preserve"> </w:t>
@@ -18040,13 +18051,13 @@
         <w:t xml:space="preserve"> </w:t>
       </w:r>
       <w:r>
-        <w:t xml:space="preserve">the six extracts the range is 0.6–3.0%. In the model’s own panel, named-to-named flow is</w:t>
-      </w:r>
-      <w:r>
-        <w:t xml:space="preserve"> </w:t>
-      </w:r>
-      <w:r>
-        <w:t xml:space="preserve">2.8% of US$570bn. The graph is therefore dominated by named-entity–retail edges.</w:t>
+        <w:t xml:space="preserve">the six coverage extracts (the hourly, extended-window and daily builds) the range is 0.6–3.0%. In the panel</w:t>
+      </w:r>
+      <w:r>
+        <w:t xml:space="preserve"> </w:t>
+      </w:r>
+      <w:r>
+        <w:t xml:space="preserve">that is actually fed to the model, named-to-named flow is 2.8% of US$570bn. The graph is therefore dominated by named-entity–retail edges.</w:t>
       </w:r>
     </w:p>
     <w:p>
@@ -18260,18 +18271,112 @@
         <w:t xml:space="preserve"> </w:t>
       </w:r>
       <w:r>
-        <w:t xml:space="preserve">0.161 [0.056, 0.222] for the own lag. Adding the network to the own lag changes squared error by</w:t>
-      </w:r>
-      <w:r>
-        <w:t xml:space="preserve"> </w:t>
-      </w:r>
-      <m:oMath>
+        <w:t xml:space="preserve">0.161 [0.056, 0.222] for the own lag. The network’s squared-error gain over the own lag,</w:t>
+      </w:r>
+      <w:r>
+        <w:t xml:space="preserve"> </w:t>
+      </w:r>
+      <m:oMath>
+        <m:r>
+          <m:t>1</m:t>
+        </m:r>
         <m:r>
           <m:rPr>
             <m:sty m:val="p"/>
           </m:rPr>
           <m:t>−</m:t>
         </m:r>
+        <m:r>
+          <m:rPr>
+            <m:sty m:val="p"/>
+          </m:rPr>
+          <m:t>S</m:t>
+        </m:r>
+        <m:r>
+          <m:rPr>
+            <m:sty m:val="p"/>
+          </m:rPr>
+          <m:t>S</m:t>
+        </m:r>
+        <m:r>
+          <m:rPr>
+            <m:sty m:val="p"/>
+          </m:rPr>
+          <m:t>E</m:t>
+        </m:r>
+        <m:d>
+          <m:dPr>
+            <m:begChr m:val="("/>
+            <m:endChr m:val=")"/>
+            <m:sepChr m:val=""/>
+            <m:grow/>
+          </m:dPr>
+          <m:e>
+            <m:r>
+              <m:t>m</m:t>
+            </m:r>
+          </m:e>
+        </m:d>
+        <m:r>
+          <m:rPr>
+            <m:sty m:val="p"/>
+          </m:rPr>
+          <m:t>/</m:t>
+        </m:r>
+        <m:r>
+          <m:rPr>
+            <m:sty m:val="p"/>
+          </m:rPr>
+          <m:t>S</m:t>
+        </m:r>
+        <m:r>
+          <m:rPr>
+            <m:sty m:val="p"/>
+          </m:rPr>
+          <m:t>S</m:t>
+        </m:r>
+        <m:r>
+          <m:rPr>
+            <m:sty m:val="p"/>
+          </m:rPr>
+          <m:t>E</m:t>
+        </m:r>
+        <m:d>
+          <m:dPr>
+            <m:begChr m:val="("/>
+            <m:endChr m:val=")"/>
+            <m:sepChr m:val=""/>
+            <m:grow/>
+          </m:dPr>
+          <m:e>
+            <m:r>
+              <m:rPr>
+                <m:sty m:val="p"/>
+              </m:rPr>
+              <m:t>A</m:t>
+            </m:r>
+            <m:r>
+              <m:rPr>
+                <m:sty m:val="p"/>
+              </m:rPr>
+              <m:t>R</m:t>
+            </m:r>
+          </m:e>
+        </m:d>
+      </m:oMath>
+      <w:r>
+        <w:t xml:space="preserve">, is</w:t>
+      </w:r>
+      <w:r>
+        <w:t xml:space="preserve"> </w:t>
+      </w:r>
+      <m:oMath>
+        <m:r>
+          <m:rPr>
+            <m:sty m:val="p"/>
+          </m:rPr>
+          <m:t>−</m:t>
+        </m:r>
       </m:oMath>
       <w:r>
         <w:t xml:space="preserve">0.3% [</w:t>
@@ -18285,7 +18390,7 @@
         </m:r>
       </m:oMath>
       <w:r>
-        <w:t xml:space="preserve">2.0%, 1.4%], and the network alone changes squared error by</w:t>
+        <w:t xml:space="preserve">2.0%, 1.4%] when added to the own lag and</w:t>
       </w:r>
       <w:r>
         <w:t xml:space="preserve"> </w:t>
@@ -18324,7 +18429,7 @@
         </m:r>
       </m:oMath>
       <w:r>
-        <w:t xml:space="preserve">6.2%], so it is worse than the own lag. The large entity-level gains are for retail</w:t>
+        <w:t xml:space="preserve">6.2%] when used alone, so the network alone has larger error than the own lag. The large entity-level gains are for retail</w:t>
       </w:r>
       <w:r>
         <w:t xml:space="preserve"> </w:t>
@@ -20231,7 +20336,18 @@
         </m:r>
       </m:oMath>
       <w:r>
-        <w:t xml:space="preserve">retail). Of the ten largest channels</w:t>
+        <w:t xml:space="preserve">retail; the interval is for the maximum over all pairs in each replicate, whereas the channel’s own interval is in Table </w:t>
+      </w:r>
+      <w:hyperlink w:anchor="tab:channels">
+        <w:r>
+          <w:rPr>
+            <w:rStyle w:val="Hyperlink"/>
+          </w:rPr>
+          <w:t xml:space="preserve">[tab:channels]</w:t>
+        </w:r>
+      </w:hyperlink>
+      <w:r>
+        <w:t xml:space="preserve">). Of the ten largest channels</w:t>
       </w:r>
       <w:r>
         <w:t xml:space="preserve"> </w:t>
@@ -23033,7 +23149,7 @@
         <w:t xml:space="preserve"> </w:t>
       </w:r>
       <w:r>
-        <w:t xml:space="preserve">(point estimates from the archived no-retail run). Exported-risk levels scale with the number of entities, so only ranks</w:t>
+        <w:t xml:space="preserve">(point estimates, no interval). Exported-risk levels scale with the number of entities, so only ranks</w:t>
       </w:r>
       <w:r>
         <w:t xml:space="preserve"> </w:t>
@@ -27256,7 +27372,13 @@
         </m:r>
       </m:oMath>
       <w:r>
-        <w:t xml:space="preserve">, edge-dropping, latent-shock and coefficient-noise checks use archived runs (</w:t>
+        <w:t xml:space="preserve">, edge-dropping, latent-shock and coefficient-noise checks are point comparisons without bootstrap intervals</w:t>
+      </w:r>
+      <w:r>
+        <w:t xml:space="preserve"> </w:t>
+      </w:r>
+      <w:r>
+        <w:t xml:space="preserve">(</w:t>
       </w:r>
       <w:r>
         <w:rPr>
@@ -27277,7 +27399,7 @@
         <w:t xml:space="preserve">revision*.json</w:t>
       </w:r>
       <w:r>
-        <w:t xml:space="preserve">) that predate the circular-block shock draws, so they are point comparisons without bootstrap intervals. The top-</w:t>
+        <w:t xml:space="preserve">). The top-</w:t>
       </w:r>
       <m:oMath>
         <m:r>
@@ -27371,7 +27493,7 @@
         </m:r>
       </m:oMath>
       <w:r>
-        <w:t xml:space="preserve">), and the top-three overlap is 3 and 3 entities. The top channel,</w:t>
+        <w:t xml:space="preserve">), and the top-three overlap with the main run is 3 and 3 of three entities. The top channel,</w:t>
       </w:r>
       <w:r>
         <w:t xml:space="preserve"> </w:t>
@@ -27481,7 +27603,7 @@
         <w:t xml:space="preserve"> </w:t>
       </w:r>
       <w:r>
-        <w:t xml:space="preserve">with a top-three overlap of 0.67. Coefficient noise (15% relative standard deviation) changes the Binance</w:t>
+        <w:t xml:space="preserve">with a mean top-three overlap fraction of 0.67. Coefficient noise (15% relative standard deviation) changes the Binance</w:t>
       </w:r>
       <m:oMath>
         <m:r>

</xml_diff>